<commit_message>
docs: renomeia resultado.html para index.html e atualiza referência no README
</commit_message>
<xml_diff>
--- a/docs/relatorio_tecnico_abnt.docx
+++ b/docs/relatorio_tecnico_abnt.docx
@@ -710,23 +710,7 @@
                   <w:rFonts w:ascii="Times New Roman" w:hAnsi="Times New Roman"/>
                   <w:sz w:val="20"/>
                 </w:rPr>
-                <w:t>https://github.com/tech-challenge-fiap-G</w:t>
-              </w:r>
-              <w:r>
-                <w:rPr>
-                  <w:rStyle w:val="Hyperlink"/>
-                  <w:rFonts w:ascii="Times New Roman" w:hAnsi="Times New Roman"/>
-                  <w:sz w:val="20"/>
-                </w:rPr>
-                <w:t>R</w:t>
-              </w:r>
-              <w:r>
-                <w:rPr>
-                  <w:rStyle w:val="Hyperlink"/>
-                  <w:rFonts w:ascii="Times New Roman" w:hAnsi="Times New Roman"/>
-                  <w:sz w:val="20"/>
-                </w:rPr>
-                <w:t>UPO-2026/tech-challenge-fase2</w:t>
+                <w:t>https://github.com/tech-challenge-fiap-GRUPO-2026/tech-challenge-fase2</w:t>
               </w:r>
             </w:hyperlink>
           </w:p>
@@ -817,24 +801,18 @@
                   <w:rFonts w:ascii="Times New Roman" w:hAnsi="Times New Roman"/>
                   <w:sz w:val="20"/>
                 </w:rPr>
-                <w:t>resultado</w:t>
+                <w:t xml:space="preserve">Página de </w:t>
               </w:r>
+              <w:proofErr w:type="spellStart"/>
               <w:r>
                 <w:rPr>
                   <w:rStyle w:val="Hyperlink"/>
                   <w:rFonts w:ascii="Times New Roman" w:hAnsi="Times New Roman"/>
                   <w:sz w:val="20"/>
                 </w:rPr>
-                <w:t>.</w:t>
+                <w:t>resultados</w:t>
               </w:r>
-              <w:r>
-                <w:rPr>
-                  <w:rStyle w:val="Hyperlink"/>
-                  <w:rFonts w:ascii="Times New Roman" w:hAnsi="Times New Roman"/>
-                  <w:sz w:val="20"/>
-                </w:rPr>
-                <w:t>html</w:t>
-              </w:r>
+              <w:proofErr w:type="spellEnd"/>
             </w:hyperlink>
           </w:p>
         </w:tc>
@@ -918,7 +896,23 @@
           <w:rFonts w:ascii="Times New Roman" w:hAnsi="Times New Roman"/>
           <w:sz w:val="24"/>
         </w:rPr>
-        <w:t xml:space="preserve">As principais contribuições deste trabalho incluem: (i) arquitetura incremental em sprints, evoluindo de um resolvedor TSP simples até um sistema VRP completo com LLM; (ii) função de fitness multi-objetivo com quatro componentes de penalização logística; (iii) cromossomo de frota para evolução conjunta de distribuição e ordem no VRP; (iv) camada LLM testável, offline por padrão e com integração OpenAI opcional; e (v) análise experimental de cinco configurações VRP comparando convergência, tempo e </w:t>
+        <w:t xml:space="preserve">As principais contribuições deste trabalho incluem: (i) arquitetura incremental em sprints, evoluindo de um resolvedor TSP simples até um sistema VRP completo com LLM; (ii) função de fitness multi-objetivo com quatro componentes de penalização logística; (iii) cromossomo de frota para evolução conjunta de distribuição e ordem no VRP; (iv) camada LLM testável, offline por padrão e com integração OpenAI opcional; e (v) análise experimental de cinco configurações VRP comparando </w:t>
+      </w:r>
+      <w:proofErr w:type="spellStart"/>
+      <w:r>
+        <w:rPr>
+          <w:rFonts w:ascii="Times New Roman" w:hAnsi="Times New Roman"/>
+          <w:sz w:val="24"/>
+        </w:rPr>
+        <w:t>convergência</w:t>
+      </w:r>
+      <w:proofErr w:type="spellEnd"/>
+      <w:r>
+        <w:rPr>
+          <w:rFonts w:ascii="Times New Roman" w:hAnsi="Times New Roman"/>
+          <w:sz w:val="24"/>
+        </w:rPr>
+        <w:t xml:space="preserve">, tempo e </w:t>
       </w:r>
       <w:proofErr w:type="spellStart"/>
       <w:r>
@@ -1113,7 +1107,39 @@
           <w:rFonts w:ascii="Times New Roman" w:hAnsi="Times New Roman"/>
           <w:sz w:val="24"/>
         </w:rPr>
-        <w:t xml:space="preserve">No contexto médico deste projeto, cada ponto representa um local de entrega de medicamentos ou insumos. O depósito representa o ponto de partida da rota, e o custo é composto pela distância euclidiana entre os pontos </w:t>
+        <w:t xml:space="preserve">No contexto médico deste projeto, cada ponto representa um local de entrega de medicamentos ou insumos. O depósito representa o ponto de partida da rota, e o custo é composto pela distância euclidiana entre </w:t>
+      </w:r>
+      <w:proofErr w:type="spellStart"/>
+      <w:r>
+        <w:rPr>
+          <w:rFonts w:ascii="Times New Roman" w:hAnsi="Times New Roman"/>
+          <w:sz w:val="24"/>
+        </w:rPr>
+        <w:t>os</w:t>
+      </w:r>
+      <w:proofErr w:type="spellEnd"/>
+      <w:r>
+        <w:rPr>
+          <w:rFonts w:ascii="Times New Roman" w:hAnsi="Times New Roman"/>
+          <w:sz w:val="24"/>
+        </w:rPr>
+        <w:t xml:space="preserve"> </w:t>
+      </w:r>
+      <w:proofErr w:type="spellStart"/>
+      <w:r>
+        <w:rPr>
+          <w:rFonts w:ascii="Times New Roman" w:hAnsi="Times New Roman"/>
+          <w:sz w:val="24"/>
+        </w:rPr>
+        <w:t>pontos</w:t>
+      </w:r>
+      <w:proofErr w:type="spellEnd"/>
+      <w:r>
+        <w:rPr>
+          <w:rFonts w:ascii="Times New Roman" w:hAnsi="Times New Roman"/>
+          <w:sz w:val="24"/>
+        </w:rPr>
+        <w:t xml:space="preserve"> </w:t>
       </w:r>
       <w:proofErr w:type="spellStart"/>
       <w:r>
@@ -1339,7 +1365,39 @@
           <w:rFonts w:ascii="Times New Roman" w:hAnsi="Times New Roman"/>
           <w:sz w:val="24"/>
         </w:rPr>
-        <w:t xml:space="preserve"> injeção de um cliente compatível (OpenAI), realiza </w:t>
+        <w:t xml:space="preserve"> injeção de um cliente </w:t>
+      </w:r>
+      <w:proofErr w:type="spellStart"/>
+      <w:r>
+        <w:rPr>
+          <w:rFonts w:ascii="Times New Roman" w:hAnsi="Times New Roman"/>
+          <w:sz w:val="24"/>
+        </w:rPr>
+        <w:t>compatível</w:t>
+      </w:r>
+      <w:proofErr w:type="spellEnd"/>
+      <w:r>
+        <w:rPr>
+          <w:rFonts w:ascii="Times New Roman" w:hAnsi="Times New Roman"/>
+          <w:sz w:val="24"/>
+        </w:rPr>
+        <w:t xml:space="preserve"> (OpenAI), </w:t>
+      </w:r>
+      <w:proofErr w:type="spellStart"/>
+      <w:r>
+        <w:rPr>
+          <w:rFonts w:ascii="Times New Roman" w:hAnsi="Times New Roman"/>
+          <w:sz w:val="24"/>
+        </w:rPr>
+        <w:t>realiza</w:t>
+      </w:r>
+      <w:proofErr w:type="spellEnd"/>
+      <w:r>
+        <w:rPr>
+          <w:rFonts w:ascii="Times New Roman" w:hAnsi="Times New Roman"/>
+          <w:sz w:val="24"/>
+        </w:rPr>
+        <w:t xml:space="preserve"> </w:t>
       </w:r>
       <w:proofErr w:type="spellStart"/>
       <w:r>
@@ -1688,7 +1746,23 @@
           <w:rFonts w:ascii="Times New Roman" w:hAnsi="Times New Roman"/>
           <w:sz w:val="24"/>
         </w:rPr>
-        <w:t xml:space="preserve">A validação foi conduzida com testes automatizados usando pytest em cada sprint. A última validação registrada apresentou 62 testes passando, cobrindo algoritmo genético, fitness, modelos de dados, leitura de CSV, </w:t>
+        <w:t xml:space="preserve">A validação foi conduzida com testes automatizados usando pytest em cada sprint. A última validação registrada apresentou 62 testes passando, cobrindo algoritmo genético, fitness, modelos de dados, </w:t>
+      </w:r>
+      <w:proofErr w:type="spellStart"/>
+      <w:r>
+        <w:rPr>
+          <w:rFonts w:ascii="Times New Roman" w:hAnsi="Times New Roman"/>
+          <w:sz w:val="24"/>
+        </w:rPr>
+        <w:t>leitura</w:t>
+      </w:r>
+      <w:proofErr w:type="spellEnd"/>
+      <w:r>
+        <w:rPr>
+          <w:rFonts w:ascii="Times New Roman" w:hAnsi="Times New Roman"/>
+          <w:sz w:val="24"/>
+        </w:rPr>
+        <w:t xml:space="preserve"> de CSV, </w:t>
       </w:r>
       <w:proofErr w:type="spellStart"/>
       <w:r>

</xml_diff>

<commit_message>
docs: adiciona link do GitHub Pages da página de resultados no README
</commit_message>
<xml_diff>
--- a/docs/relatorio_tecnico_abnt.docx
+++ b/docs/relatorio_tecnico_abnt.docx
@@ -810,7 +810,23 @@
                   <w:rFonts w:ascii="Times New Roman" w:hAnsi="Times New Roman"/>
                   <w:sz w:val="20"/>
                 </w:rPr>
-                <w:t>resultados</w:t>
+                <w:t>re</w:t>
+              </w:r>
+              <w:r>
+                <w:rPr>
+                  <w:rStyle w:val="Hyperlink"/>
+                  <w:rFonts w:ascii="Times New Roman" w:hAnsi="Times New Roman"/>
+                  <w:sz w:val="20"/>
+                </w:rPr>
+                <w:t>s</w:t>
+              </w:r>
+              <w:r>
+                <w:rPr>
+                  <w:rStyle w:val="Hyperlink"/>
+                  <w:rFonts w:ascii="Times New Roman" w:hAnsi="Times New Roman"/>
+                  <w:sz w:val="20"/>
+                </w:rPr>
+                <w:t>ultados</w:t>
               </w:r>
               <w:proofErr w:type="spellEnd"/>
             </w:hyperlink>

</xml_diff>

<commit_message>
docs: enriquece relatorio ABNT com detalhes de crossover, mutação e fitness VRP e análise completa dos experimentos
</commit_message>
<xml_diff>
--- a/docs/relatorio_tecnico_abnt.docx
+++ b/docs/relatorio_tecnico_abnt.docx
@@ -810,23 +810,7 @@
                   <w:rFonts w:ascii="Times New Roman" w:hAnsi="Times New Roman"/>
                   <w:sz w:val="20"/>
                 </w:rPr>
-                <w:t>re</w:t>
-              </w:r>
-              <w:r>
-                <w:rPr>
-                  <w:rStyle w:val="Hyperlink"/>
-                  <w:rFonts w:ascii="Times New Roman" w:hAnsi="Times New Roman"/>
-                  <w:sz w:val="20"/>
-                </w:rPr>
-                <w:t>s</w:t>
-              </w:r>
-              <w:r>
-                <w:rPr>
-                  <w:rStyle w:val="Hyperlink"/>
-                  <w:rFonts w:ascii="Times New Roman" w:hAnsi="Times New Roman"/>
-                  <w:sz w:val="20"/>
-                </w:rPr>
-                <w:t>ultados</w:t>
+                <w:t>resultados</w:t>
               </w:r>
               <w:proofErr w:type="spellEnd"/>
             </w:hyperlink>
@@ -912,7 +896,39 @@
           <w:rFonts w:ascii="Times New Roman" w:hAnsi="Times New Roman"/>
           <w:sz w:val="24"/>
         </w:rPr>
-        <w:t xml:space="preserve">As principais contribuições deste trabalho incluem: (i) arquitetura incremental em sprints, evoluindo de um resolvedor TSP simples até um sistema VRP completo com LLM; (ii) função de fitness multi-objetivo com quatro componentes de penalização logística; (iii) cromossomo de frota para evolução conjunta de distribuição e ordem no VRP; (iv) camada LLM testável, offline por padrão e com integração OpenAI opcional; e (v) análise experimental de cinco configurações VRP comparando </w:t>
+        <w:t xml:space="preserve">As principais contribuições deste trabalho incluem: (i) arquitetura incremental em sprints, evoluindo de um resolvedor TSP simples até um sistema VRP completo com LLM; (ii) função de fitness multi-objetivo com quatro componentes de penalização logística; (iii) cromossomo de frota para evolução conjunta de distribuição e ordem no VRP; (iv) camada LLM testável, offline por padrão e com integração OpenAI opcional; e (v) análise experimental de cinco </w:t>
+      </w:r>
+      <w:proofErr w:type="spellStart"/>
+      <w:r>
+        <w:rPr>
+          <w:rFonts w:ascii="Times New Roman" w:hAnsi="Times New Roman"/>
+          <w:sz w:val="24"/>
+        </w:rPr>
+        <w:t>configurações</w:t>
+      </w:r>
+      <w:proofErr w:type="spellEnd"/>
+      <w:r>
+        <w:rPr>
+          <w:rFonts w:ascii="Times New Roman" w:hAnsi="Times New Roman"/>
+          <w:sz w:val="24"/>
+        </w:rPr>
+        <w:t xml:space="preserve"> VRP </w:t>
+      </w:r>
+      <w:proofErr w:type="spellStart"/>
+      <w:r>
+        <w:rPr>
+          <w:rFonts w:ascii="Times New Roman" w:hAnsi="Times New Roman"/>
+          <w:sz w:val="24"/>
+        </w:rPr>
+        <w:t>comparando</w:t>
+      </w:r>
+      <w:proofErr w:type="spellEnd"/>
+      <w:r>
+        <w:rPr>
+          <w:rFonts w:ascii="Times New Roman" w:hAnsi="Times New Roman"/>
+          <w:sz w:val="24"/>
+        </w:rPr>
+        <w:t xml:space="preserve"> </w:t>
       </w:r>
       <w:proofErr w:type="spellStart"/>
       <w:r>
@@ -1123,7 +1139,39 @@
           <w:rFonts w:ascii="Times New Roman" w:hAnsi="Times New Roman"/>
           <w:sz w:val="24"/>
         </w:rPr>
-        <w:t xml:space="preserve">No contexto médico deste projeto, cada ponto representa um local de entrega de medicamentos ou insumos. O depósito representa o ponto de partida da rota, e o custo é composto pela distância euclidiana entre </w:t>
+        <w:t xml:space="preserve">No contexto médico deste projeto, cada ponto representa um local de entrega de medicamentos ou insumos. O depósito representa o ponto de partida da rota, e o custo é composto pela </w:t>
+      </w:r>
+      <w:proofErr w:type="spellStart"/>
+      <w:r>
+        <w:rPr>
+          <w:rFonts w:ascii="Times New Roman" w:hAnsi="Times New Roman"/>
+          <w:sz w:val="24"/>
+        </w:rPr>
+        <w:t>distância</w:t>
+      </w:r>
+      <w:proofErr w:type="spellEnd"/>
+      <w:r>
+        <w:rPr>
+          <w:rFonts w:ascii="Times New Roman" w:hAnsi="Times New Roman"/>
+          <w:sz w:val="24"/>
+        </w:rPr>
+        <w:t xml:space="preserve"> </w:t>
+      </w:r>
+      <w:proofErr w:type="spellStart"/>
+      <w:r>
+        <w:rPr>
+          <w:rFonts w:ascii="Times New Roman" w:hAnsi="Times New Roman"/>
+          <w:sz w:val="24"/>
+        </w:rPr>
+        <w:t>euclidiana</w:t>
+      </w:r>
+      <w:proofErr w:type="spellEnd"/>
+      <w:r>
+        <w:rPr>
+          <w:rFonts w:ascii="Times New Roman" w:hAnsi="Times New Roman"/>
+          <w:sz w:val="24"/>
+        </w:rPr>
+        <w:t xml:space="preserve"> entre </w:t>
       </w:r>
       <w:proofErr w:type="spellStart"/>
       <w:r>
@@ -1381,7 +1429,23 @@
           <w:rFonts w:ascii="Times New Roman" w:hAnsi="Times New Roman"/>
           <w:sz w:val="24"/>
         </w:rPr>
-        <w:t xml:space="preserve"> injeção de um cliente </w:t>
+        <w:t xml:space="preserve"> injeção de um </w:t>
+      </w:r>
+      <w:proofErr w:type="spellStart"/>
+      <w:r>
+        <w:rPr>
+          <w:rFonts w:ascii="Times New Roman" w:hAnsi="Times New Roman"/>
+          <w:sz w:val="24"/>
+        </w:rPr>
+        <w:t>cliente</w:t>
+      </w:r>
+      <w:proofErr w:type="spellEnd"/>
+      <w:r>
+        <w:rPr>
+          <w:rFonts w:ascii="Times New Roman" w:hAnsi="Times New Roman"/>
+          <w:sz w:val="24"/>
+        </w:rPr>
+        <w:t xml:space="preserve"> </w:t>
       </w:r>
       <w:proofErr w:type="spellStart"/>
       <w:r>
@@ -1762,7 +1826,23 @@
           <w:rFonts w:ascii="Times New Roman" w:hAnsi="Times New Roman"/>
           <w:sz w:val="24"/>
         </w:rPr>
-        <w:t xml:space="preserve">A validação foi conduzida com testes automatizados usando pytest em cada sprint. A última validação registrada apresentou 62 testes passando, cobrindo algoritmo genético, fitness, modelos de dados, </w:t>
+        <w:t xml:space="preserve">A validação foi conduzida com testes automatizados usando pytest em cada sprint. A última validação registrada apresentou 62 testes passando, cobrindo algoritmo genético, fitness, </w:t>
+      </w:r>
+      <w:proofErr w:type="spellStart"/>
+      <w:r>
+        <w:rPr>
+          <w:rFonts w:ascii="Times New Roman" w:hAnsi="Times New Roman"/>
+          <w:sz w:val="24"/>
+        </w:rPr>
+        <w:t>modelos</w:t>
+      </w:r>
+      <w:proofErr w:type="spellEnd"/>
+      <w:r>
+        <w:rPr>
+          <w:rFonts w:ascii="Times New Roman" w:hAnsi="Times New Roman"/>
+          <w:sz w:val="24"/>
+        </w:rPr>
+        <w:t xml:space="preserve"> de dados, </w:t>
       </w:r>
       <w:proofErr w:type="spellStart"/>
       <w:r>
@@ -2431,14 +2511,324 @@
       <w:pPr>
         <w:spacing w:before="80" w:after="240" w:line="360" w:lineRule="auto"/>
         <w:jc w:val="center"/>
-      </w:pPr>
-      <w:r>
         <w:rPr>
           <w:rFonts w:ascii="Times New Roman" w:hAnsi="Times New Roman"/>
           <w:i/>
           <w:sz w:val="20"/>
         </w:rPr>
-        <w:t>Fonte: elaborado pelos autores.</w:t>
+      </w:pPr>
+      <w:r>
+        <w:rPr>
+          <w:rFonts w:ascii="Times New Roman" w:hAnsi="Times New Roman"/>
+          <w:i/>
+          <w:sz w:val="20"/>
+        </w:rPr>
+        <w:t xml:space="preserve">Fonte: </w:t>
+      </w:r>
+      <w:proofErr w:type="spellStart"/>
+      <w:r>
+        <w:rPr>
+          <w:rFonts w:ascii="Times New Roman" w:hAnsi="Times New Roman"/>
+          <w:i/>
+          <w:sz w:val="20"/>
+        </w:rPr>
+        <w:t>elaborado</w:t>
+      </w:r>
+      <w:proofErr w:type="spellEnd"/>
+      <w:r>
+        <w:rPr>
+          <w:rFonts w:ascii="Times New Roman" w:hAnsi="Times New Roman"/>
+          <w:i/>
+          <w:sz w:val="20"/>
+        </w:rPr>
+        <w:t xml:space="preserve"> </w:t>
+      </w:r>
+      <w:proofErr w:type="spellStart"/>
+      <w:r>
+        <w:rPr>
+          <w:rFonts w:ascii="Times New Roman" w:hAnsi="Times New Roman"/>
+          <w:i/>
+          <w:sz w:val="20"/>
+        </w:rPr>
+        <w:t>pelos</w:t>
+      </w:r>
+      <w:proofErr w:type="spellEnd"/>
+      <w:r>
+        <w:rPr>
+          <w:rFonts w:ascii="Times New Roman" w:hAnsi="Times New Roman"/>
+          <w:i/>
+          <w:sz w:val="20"/>
+        </w:rPr>
+        <w:t xml:space="preserve"> </w:t>
+      </w:r>
+      <w:proofErr w:type="spellStart"/>
+      <w:r>
+        <w:rPr>
+          <w:rFonts w:ascii="Times New Roman" w:hAnsi="Times New Roman"/>
+          <w:i/>
+          <w:sz w:val="20"/>
+        </w:rPr>
+        <w:t>autores</w:t>
+      </w:r>
+      <w:proofErr w:type="spellEnd"/>
+      <w:r>
+        <w:rPr>
+          <w:rFonts w:ascii="Times New Roman" w:hAnsi="Times New Roman"/>
+          <w:i/>
+          <w:sz w:val="20"/>
+        </w:rPr>
+        <w:t>.</w:t>
+      </w:r>
+    </w:p>
+    <w:p>
+      <w:pPr>
+        <w:spacing w:before="80" w:after="240" w:line="360" w:lineRule="auto"/>
+        <w:jc w:val="center"/>
+        <w:rPr>
+          <w:rFonts w:ascii="Times New Roman" w:hAnsi="Times New Roman"/>
+          <w:i/>
+          <w:sz w:val="20"/>
+        </w:rPr>
+      </w:pPr>
+    </w:p>
+    <w:p>
+      <w:pPr>
+        <w:spacing w:before="80" w:after="240" w:line="360" w:lineRule="auto"/>
+        <w:jc w:val="center"/>
+      </w:pPr>
+    </w:p>
+    <w:p>
+      <w:r>
+        <w:rPr>
+          <w:rFonts w:ascii="Times New Roman" w:hAnsi="Times New Roman"/>
+        </w:rPr>
+        <w:lastRenderedPageBreak/>
+        <w:t>4.2.1 Função de Fitness no Modo VRP</w:t>
+      </w:r>
+    </w:p>
+    <w:p>
+      <w:r>
+        <w:rPr>
+          <w:rFonts w:ascii="Times New Roman" w:hAnsi="Times New Roman"/>
+        </w:rPr>
+        <w:t>No modo VRP, o fitness não é calculado para uma única rota, mas para toda a frota de veículos. Cada rota individual é avaliada com as restrições específicas do veículo que a executa (capacidade máxima e distância máxima independentes). A fórmula por rota é:</w:t>
+      </w:r>
+    </w:p>
+    <w:p>
+      <w:r>
+        <w:rPr>
+          <w:rFonts w:ascii="Times New Roman" w:hAnsi="Times New Roman"/>
+        </w:rPr>
+        <w:t>fitness(rota_v) = distância(rota_v)</w:t>
+      </w:r>
+      <w:r>
+        <w:rPr>
+          <w:rFonts w:ascii="Times New Roman" w:hAnsi="Times New Roman"/>
+        </w:rPr>
+        <w:br/>
+        <w:t xml:space="preserve">               + penalidade_atraso(rota_v)</w:t>
+      </w:r>
+      <w:r>
+        <w:rPr>
+          <w:rFonts w:ascii="Times New Roman" w:hAnsi="Times New Roman"/>
+        </w:rPr>
+        <w:br/>
+        <w:t xml:space="preserve">               + penalidade_capacidade(rota_v, veículo_v.max_capacity)</w:t>
+      </w:r>
+      <w:r>
+        <w:rPr>
+          <w:rFonts w:ascii="Times New Roman" w:hAnsi="Times New Roman"/>
+        </w:rPr>
+        <w:br/>
+        <w:t xml:space="preserve">               + penalidade_autonomia(rota_v, veículo_v.max_distance)</w:t>
+      </w:r>
+    </w:p>
+    <w:p>
+      <w:r>
+        <w:rPr>
+          <w:rFonts w:ascii="Times New Roman" w:hAnsi="Times New Roman"/>
+        </w:rPr>
+        <w:t>O fitness total da frota é a soma dos fitness individuais de todos os veículos:</w:t>
+      </w:r>
+    </w:p>
+    <w:p>
+      <w:r>
+        <w:rPr>
+          <w:rFonts w:ascii="Times New Roman" w:hAnsi="Times New Roman"/>
+        </w:rPr>
+        <w:t>fitness_total = Σ fitness(rota_v)   para todo veículo v na frota</w:t>
+      </w:r>
+    </w:p>
+    <w:p>
+      <w:r>
+        <w:rPr>
+          <w:rFonts w:ascii="Times New Roman" w:hAnsi="Times New Roman"/>
+        </w:rPr>
+        <w:t>O algoritmo minimiza fitness_total — melhoras em qualquer rota individual contribuem diretamente para a melhora da solução de frota completa.</w:t>
+      </w:r>
+    </w:p>
+    <w:p>
+      <w:r>
+        <w:rPr>
+          <w:rFonts w:ascii="Times New Roman" w:hAnsi="Times New Roman"/>
+        </w:rPr>
+        <w:t>4.2.2 Modelo de Tempo de Chegada e Penalidade por Atraso</w:t>
+      </w:r>
+    </w:p>
+    <w:p>
+      <w:r>
+        <w:rPr>
+          <w:rFonts w:ascii="Times New Roman" w:hAnsi="Times New Roman"/>
+        </w:rPr>
+        <w:t>O cálculo do fitness percorre a sequência de entregas acumulando o tempo de chegada com base na distância euclidiana entre pontos consecutivos. A velocidade é normalizada: cada unidade de distância equivale a uma unidade de tempo. Para cada entrega visitada, o algoritmo verifica se o tempo de chegada excede o prazo (due_time) e aplica a penalidade correspondente à prioridade:</w:t>
+      </w:r>
+    </w:p>
+    <w:p>
+      <w:r>
+        <w:rPr>
+          <w:rFonts w:ascii="Times New Roman" w:hAnsi="Times New Roman"/>
+        </w:rPr>
+        <w:t>• Prioridade HIGH:   penalidade = (chegada − due_time) × 100,0</w:t>
+      </w:r>
+      <w:r>
+        <w:rPr>
+          <w:rFonts w:ascii="Times New Roman" w:hAnsi="Times New Roman"/>
+        </w:rPr>
+        <w:br/>
+        <w:t>• Prioridade MEDIUM: penalidade = (chegada − due_time) × 30,0</w:t>
+      </w:r>
+      <w:r>
+        <w:rPr>
+          <w:rFonts w:ascii="Times New Roman" w:hAnsi="Times New Roman"/>
+        </w:rPr>
+        <w:br/>
+        <w:t>• Prioridade LOW:    penalidade = (chegada − due_time) × 10,0</w:t>
+      </w:r>
+    </w:p>
+    <w:p>
+      <w:r>
+        <w:rPr>
+          <w:rFonts w:ascii="Times New Roman" w:hAnsi="Times New Roman"/>
+        </w:rPr>
+        <w:t>A penalidade de atraso é aplicada somente quando chegada &gt; due_time; caso contrário, o valor é zero. As constantes foram calibradas para que entregas HIGH atrasadas sejam 10 vezes mais penalizadas que entregas LOW, forçando o AG a priorizar rotas que respeitem os prazos críticos.</w:t>
+      </w:r>
+    </w:p>
+    <w:p>
+      <w:r>
+        <w:rPr>
+          <w:rFonts w:ascii="Times New Roman" w:hAnsi="Times New Roman"/>
+        </w:rPr>
+        <w:t>4.2.3 Penalidades de Capacidade e Autonomia</w:t>
+      </w:r>
+    </w:p>
+    <w:p>
+      <w:r>
+        <w:rPr>
+          <w:rFonts w:ascii="Times New Roman" w:hAnsi="Times New Roman"/>
+        </w:rPr>
+        <w:t>Além das penalidades por atraso, dois fatores operacionais são penalizados proporcionalmente ao excesso em relação ao limite do veículo:</w:t>
+      </w:r>
+    </w:p>
+    <w:p>
+      <w:r>
+        <w:rPr>
+          <w:rFonts w:ascii="Times New Roman" w:hAnsi="Times New Roman"/>
+        </w:rPr>
+        <w:t>• Excesso de capacidade: se o peso total das entregas da rota exceder max_capacity do veículo, aplica-se (peso_total − max_capacity) × 25,0. Constante: CAPACITY_EXCESS_PENALTY = 25,0.</w:t>
+      </w:r>
+      <w:r>
+        <w:rPr>
+          <w:rFonts w:ascii="Times New Roman" w:hAnsi="Times New Roman"/>
+        </w:rPr>
+        <w:br/>
+        <w:t>• Excesso de autonomia: se a distância total da rota fechada (incluindo retorno ao depósito) exceder max_distance do veículo, aplica-se (distância − max_distance) × 25,0. Constante: DISTANCE_EXCESS_PENALTY = 25,0.</w:t>
+      </w:r>
+    </w:p>
+    <w:p>
+      <w:pPr>
+        <w:rPr>
+          <w:rFonts w:ascii="Times New Roman" w:hAnsi="Times New Roman"/>
+        </w:rPr>
+      </w:pPr>
+      <w:r>
+        <w:rPr>
+          <w:rFonts w:ascii="Times New Roman" w:hAnsi="Times New Roman"/>
+        </w:rPr>
+        <w:t xml:space="preserve">As penalidades são aditivas: uma rota pode acumular simultaneamente penalidade de atraso, de capacidade excedida e de autonomia excedida. Isso garante que o AG busque soluções que respeitem múltiplas restrições ao mesmo tempo, sem que a violação de </w:t>
+      </w:r>
+      <w:proofErr w:type="spellStart"/>
+      <w:r>
+        <w:rPr>
+          <w:rFonts w:ascii="Times New Roman" w:hAnsi="Times New Roman"/>
+        </w:rPr>
+        <w:t>uma</w:t>
+      </w:r>
+      <w:proofErr w:type="spellEnd"/>
+      <w:r>
+        <w:rPr>
+          <w:rFonts w:ascii="Times New Roman" w:hAnsi="Times New Roman"/>
+        </w:rPr>
+        <w:t xml:space="preserve"> </w:t>
+      </w:r>
+      <w:proofErr w:type="spellStart"/>
+      <w:r>
+        <w:rPr>
+          <w:rFonts w:ascii="Times New Roman" w:hAnsi="Times New Roman"/>
+        </w:rPr>
+        <w:t>restrição</w:t>
+      </w:r>
+      <w:proofErr w:type="spellEnd"/>
+      <w:r>
+        <w:rPr>
+          <w:rFonts w:ascii="Times New Roman" w:hAnsi="Times New Roman"/>
+        </w:rPr>
+        <w:t xml:space="preserve"> </w:t>
+      </w:r>
+      <w:proofErr w:type="spellStart"/>
+      <w:r>
+        <w:rPr>
+          <w:rFonts w:ascii="Times New Roman" w:hAnsi="Times New Roman"/>
+        </w:rPr>
+        <w:t>mascare</w:t>
+      </w:r>
+      <w:proofErr w:type="spellEnd"/>
+      <w:r>
+        <w:rPr>
+          <w:rFonts w:ascii="Times New Roman" w:hAnsi="Times New Roman"/>
+        </w:rPr>
+        <w:t xml:space="preserve"> </w:t>
+      </w:r>
+      <w:proofErr w:type="spellStart"/>
+      <w:r>
+        <w:rPr>
+          <w:rFonts w:ascii="Times New Roman" w:hAnsi="Times New Roman"/>
+        </w:rPr>
+        <w:t>outra</w:t>
+      </w:r>
+      <w:proofErr w:type="spellEnd"/>
+      <w:r>
+        <w:rPr>
+          <w:rFonts w:ascii="Times New Roman" w:hAnsi="Times New Roman"/>
+        </w:rPr>
+        <w:t>.</w:t>
+      </w:r>
+    </w:p>
+    <w:p/>
+    <w:p>
+      <w:r>
+        <w:rPr>
+          <w:rFonts w:ascii="Times New Roman" w:hAnsi="Times New Roman"/>
+        </w:rPr>
+        <w:lastRenderedPageBreak/>
+        <w:t>4.2.4 Distância Euclidiana e Rota Fechada</w:t>
+      </w:r>
+    </w:p>
+    <w:p>
+      <w:r>
+        <w:rPr>
+          <w:rFonts w:ascii="Times New Roman" w:hAnsi="Times New Roman"/>
+        </w:rPr>
+        <w:t>A distância entre dois pontos é calculada como a distância euclidiana 2D: dist(p₁, p₂) = √[(x₁ − x₂)² + (y₁ − y₂)²]. A rota é considerada fechada — o último ponto conecta de volta ao primeiro — garantindo o retorno ao depósito. No modo VRP, quando um depósito é especificado, ele é inserido no início de cada rota antes do cálculo do fitness: [depósito, entrega₁, entrega₂, ..., entregaN], com retorno ao depósito no fechamento.</w:t>
       </w:r>
     </w:p>
     <w:p>
@@ -2474,7 +2864,6 @@
           <w:color w:val="7C3AED"/>
           <w:sz w:val="24"/>
         </w:rPr>
-        <w:lastRenderedPageBreak/>
         <w:t>4.3 Dados de Entrada</w:t>
       </w:r>
     </w:p>
@@ -2687,14 +3076,48 @@
     <w:p>
       <w:pPr>
         <w:spacing w:before="360" w:after="120" w:line="360" w:lineRule="exact"/>
-      </w:pPr>
-      <w:r>
         <w:rPr>
           <w:rFonts w:ascii="Arial" w:hAnsi="Arial"/>
           <w:b/>
           <w:color w:val="7C3AED"/>
           <w:sz w:val="24"/>
         </w:rPr>
+      </w:pPr>
+    </w:p>
+    <w:p>
+      <w:pPr>
+        <w:spacing w:before="360" w:after="120" w:line="360" w:lineRule="exact"/>
+        <w:rPr>
+          <w:rFonts w:ascii="Arial" w:hAnsi="Arial"/>
+          <w:b/>
+          <w:color w:val="7C3AED"/>
+          <w:sz w:val="24"/>
+        </w:rPr>
+      </w:pPr>
+    </w:p>
+    <w:p>
+      <w:pPr>
+        <w:spacing w:before="360" w:after="120" w:line="360" w:lineRule="exact"/>
+        <w:rPr>
+          <w:rFonts w:ascii="Arial" w:hAnsi="Arial"/>
+          <w:b/>
+          <w:color w:val="7C3AED"/>
+          <w:sz w:val="24"/>
+        </w:rPr>
+      </w:pPr>
+    </w:p>
+    <w:p>
+      <w:pPr>
+        <w:spacing w:before="360" w:after="120" w:line="360" w:lineRule="exact"/>
+      </w:pPr>
+      <w:r>
+        <w:rPr>
+          <w:rFonts w:ascii="Arial" w:hAnsi="Arial"/>
+          <w:b/>
+          <w:color w:val="7C3AED"/>
+          <w:sz w:val="24"/>
+        </w:rPr>
+        <w:lastRenderedPageBreak/>
         <w:t>4.5 Modo VRP</w:t>
       </w:r>
     </w:p>
@@ -2783,6 +3206,356 @@
       </w:r>
     </w:p>
     <w:p>
+      <w:r>
+        <w:rPr>
+          <w:rFonts w:ascii="Times New Roman" w:hAnsi="Times New Roman"/>
+        </w:rPr>
+        <w:t>4.5.1 Crossover de Frota — fleet_crossover</w:t>
+      </w:r>
+    </w:p>
+    <w:p>
+      <w:r>
+        <w:rPr>
+          <w:rFonts w:ascii="Times New Roman" w:hAnsi="Times New Roman"/>
+        </w:rPr>
+        <w:t>O crossover de frota (implementado em src/routing/vrp.py — função fleet_crossover) combina dois cromossomos de frota (pai 1 e pai 2) em três etapas:</w:t>
+      </w:r>
+    </w:p>
+    <w:p>
+      <w:r>
+        <w:rPr>
+          <w:rFonts w:ascii="Times New Roman" w:hAnsi="Times New Roman"/>
+        </w:rPr>
+        <w:t>1. Achatamento (flatten): cada cromossomo de frota — que é uma lista de listas — é convertido em uma sequência global única de entregas. Por exemplo, se o pai 1 tem veículo A com [E1, E2] e veículo B com [E3, E4, E5], a sequência achatada é [E1, E2, E3, E4, E5].</w:t>
+      </w:r>
+    </w:p>
+    <w:p>
+      <w:r>
+        <w:rPr>
+          <w:rFonts w:ascii="Times New Roman" w:hAnsi="Times New Roman"/>
+        </w:rPr>
+        <w:t>2. Order Crossover (OX) sobre as sequências globais: aplica-se o operador OX clássico sobre as duas sequências achatadas. O OX escolhe dois pontos de corte aleatórios [start, end) e copia o segmento do pai 1 nesse intervalo para o filho. As posições restantes são preenchidas com os genes do pai 2 na ordem em que aparecem, pulando os genes já presentes no filho. Isso garante que cada entrega apareça exatamente uma vez no filho — sem duplicatas ou omissões.</w:t>
+      </w:r>
+    </w:p>
+    <w:p>
+      <w:r>
+        <w:rPr>
+          <w:rFonts w:ascii="Times New Roman" w:hAnsi="Times New Roman"/>
+        </w:rPr>
+        <w:t>3. Divisão por tamanhos herdados: a sequência filha (ainda achatada) é repartida em sub-rotas usando os tamanhos de um dos pais, escolhido aleatoriamente com probabilidade 50%. Os tamanhos representam quantas entregas cada veículo recebe. Se a soma dos tamanhos for menor que o total de entregas (caso de arredondamento), as entregas excedentes são alocadas à última rota.</w:t>
+      </w:r>
+    </w:p>
+    <w:p>
+      <w:r>
+        <w:rPr>
+          <w:rFonts w:ascii="Times New Roman" w:hAnsi="Times New Roman"/>
+        </w:rPr>
+        <w:t>Exemplo com 3 veículos e 6 entregas:</w:t>
+      </w:r>
+      <w:r>
+        <w:rPr>
+          <w:rFonts w:ascii="Times New Roman" w:hAnsi="Times New Roman"/>
+        </w:rPr>
+        <w:br/>
+      </w:r>
+      <w:r>
+        <w:rPr>
+          <w:rFonts w:ascii="Times New Roman" w:hAnsi="Times New Roman"/>
+        </w:rPr>
+        <w:br/>
+        <w:t>Pai 1: [V1: E1, E2] [V2: E3, E4] [V3: E5, E6]  → tamanhos = [2, 2, 2]</w:t>
+      </w:r>
+      <w:r>
+        <w:rPr>
+          <w:rFonts w:ascii="Times New Roman" w:hAnsi="Times New Roman"/>
+        </w:rPr>
+        <w:br/>
+        <w:t>Pai 2: [V1: E4, E1, E6] [V2: E2, E5] [V3: E3]</w:t>
+      </w:r>
+      <w:r>
+        <w:rPr>
+          <w:rFonts w:ascii="Times New Roman" w:hAnsi="Times New Roman"/>
+        </w:rPr>
+        <w:br/>
+      </w:r>
+      <w:r>
+        <w:rPr>
+          <w:rFonts w:ascii="Times New Roman" w:hAnsi="Times New Roman"/>
+        </w:rPr>
+        <w:br/>
+        <w:t>Sequências achatadas:</w:t>
+      </w:r>
+      <w:r>
+        <w:rPr>
+          <w:rFonts w:ascii="Times New Roman" w:hAnsi="Times New Roman"/>
+        </w:rPr>
+        <w:br/>
+        <w:t xml:space="preserve">  Pai 1: [E1, E2, E3, E4, E5, E6]</w:t>
+      </w:r>
+      <w:r>
+        <w:rPr>
+          <w:rFonts w:ascii="Times New Roman" w:hAnsi="Times New Roman"/>
+        </w:rPr>
+        <w:br/>
+        <w:t xml:space="preserve">  Pai 2: [E4, E1, E6, E2, E5, E3]</w:t>
+      </w:r>
+      <w:r>
+        <w:rPr>
+          <w:rFonts w:ascii="Times New Roman" w:hAnsi="Times New Roman"/>
+        </w:rPr>
+        <w:br/>
+      </w:r>
+      <w:r>
+        <w:rPr>
+          <w:rFonts w:ascii="Times New Roman" w:hAnsi="Times New Roman"/>
+        </w:rPr>
+        <w:br/>
+        <w:t>OX (corte em [2, 5]):</w:t>
+      </w:r>
+      <w:r>
+        <w:rPr>
+          <w:rFonts w:ascii="Times New Roman" w:hAnsi="Times New Roman"/>
+        </w:rPr>
+        <w:br/>
+        <w:t xml:space="preserve">  Segmento copiado do Pai 1: [E3, E4, E5]</w:t>
+      </w:r>
+      <w:r>
+        <w:rPr>
+          <w:rFonts w:ascii="Times New Roman" w:hAnsi="Times New Roman"/>
+        </w:rPr>
+        <w:br/>
+      </w:r>
+      <w:r>
+        <w:rPr>
+          <w:rFonts w:ascii="Times New Roman" w:hAnsi="Times New Roman"/>
+        </w:rPr>
+        <w:lastRenderedPageBreak/>
+        <w:t xml:space="preserve">  Restantes do Pai 2 (excluindo E3, E4, E5): [E1, E6, E2]</w:t>
+      </w:r>
+      <w:r>
+        <w:rPr>
+          <w:rFonts w:ascii="Times New Roman" w:hAnsi="Times New Roman"/>
+        </w:rPr>
+        <w:br/>
+        <w:t xml:space="preserve">  Filho achatado: [E1, E6, E3, E4, E5, E2]</w:t>
+      </w:r>
+      <w:r>
+        <w:rPr>
+          <w:rFonts w:ascii="Times New Roman" w:hAnsi="Times New Roman"/>
+        </w:rPr>
+        <w:br/>
+      </w:r>
+      <w:r>
+        <w:rPr>
+          <w:rFonts w:ascii="Times New Roman" w:hAnsi="Times New Roman"/>
+        </w:rPr>
+        <w:br/>
+        <w:t>Divisão com tamanhos do Pai 1 [2, 2, 2]:</w:t>
+      </w:r>
+      <w:r>
+        <w:rPr>
+          <w:rFonts w:ascii="Times New Roman" w:hAnsi="Times New Roman"/>
+        </w:rPr>
+        <w:br/>
+        <w:t xml:space="preserve">  Filho: [V1: E1, E6] [V2: E3, E4] [V3: E5, E2]</w:t>
+      </w:r>
+    </w:p>
+    <w:p>
+      <w:r>
+        <w:rPr>
+          <w:rFonts w:ascii="Times New Roman" w:hAnsi="Times New Roman"/>
+        </w:rPr>
+        <w:t>Esta estratégia combina o que há de melhor nos dois pais: a ordem relativa das entregas é herdada via OX (preservando sub-rotas eficientes do pai), enquanto a distribuição entre veículos é herdada de um dos pais (preservando o balanceamento de carga que já foi selecionado pela pressão evolutiva).</w:t>
+      </w:r>
+    </w:p>
+    <w:p>
+      <w:r>
+        <w:rPr>
+          <w:rFonts w:ascii="Times New Roman" w:hAnsi="Times New Roman"/>
+        </w:rPr>
+        <w:t>4.5.2 Mutação de Frota — mutate_fleet</w:t>
+      </w:r>
+    </w:p>
+    <w:p>
+      <w:r>
+        <w:rPr>
+          <w:rFonts w:ascii="Times New Roman" w:hAnsi="Times New Roman"/>
+        </w:rPr>
+        <w:t>A mutação de frota (função mutate_fleet em src/routing/vrp.py) é aplicada com probabilidade mutation_probability a cada cromossomo filho gerado. Quando ativada, escolhe aleatoriamente entre três tipos de mutação, cada um projetado para explorar um aspecto diferente do espaço de busca do VRP:</w:t>
+      </w:r>
+    </w:p>
+    <w:p>
+      <w:r>
+        <w:rPr>
+          <w:rFonts w:ascii="Times New Roman" w:hAnsi="Times New Roman"/>
+        </w:rPr>
+        <w:t>Tipo 1 — Mover entrega (move):</w:t>
+      </w:r>
+      <w:r>
+        <w:rPr>
+          <w:rFonts w:ascii="Times New Roman" w:hAnsi="Times New Roman"/>
+        </w:rPr>
+        <w:br/>
+        <w:t>Retira uma entrega aleatória de uma rota não-vazia e a insere em uma posição aleatória de qualquer outra rota (inclusive a mesma). Esta mutação altera a distribuição de carga entre veículos, podendo corrigir desequilíbrios de capacidade ou aproximar entregas geograficamente próximas ao mesmo veículo.</w:t>
+      </w:r>
+      <w:r>
+        <w:rPr>
+          <w:rFonts w:ascii="Times New Roman" w:hAnsi="Times New Roman"/>
+        </w:rPr>
+        <w:br/>
+        <w:t>Implementação: origin = random.choice(non_empty_routes); delivery = mutated[origin].pop(random position); mutated[destination].insert(random position, delivery).</w:t>
+      </w:r>
+    </w:p>
+    <w:p>
+      <w:r>
+        <w:rPr>
+          <w:rFonts w:ascii="Times New Roman" w:hAnsi="Times New Roman"/>
+        </w:rPr>
+        <w:t>Tipo 2 — Trocar entregas (swap):</w:t>
+      </w:r>
+      <w:r>
+        <w:rPr>
+          <w:rFonts w:ascii="Times New Roman" w:hAnsi="Times New Roman"/>
+        </w:rPr>
+        <w:br/>
+        <w:t>Seleciona duas rotas não-vazias distintas e troca uma entrega aleatória de cada uma. Ao contrário do "move", esta operação preserva o número de entregas por veículo, alterando apenas quais entregas cada veículo realiza. É útil para explorar diferentes atribuições de entregas sem desbalancear a carga.</w:t>
+      </w:r>
+      <w:r>
+        <w:rPr>
+          <w:rFonts w:ascii="Times New Roman" w:hAnsi="Times New Roman"/>
+        </w:rPr>
+        <w:br/>
+        <w:t>Implementação: route_a, route_b = random.sample(non_empty_routes, 2); mutated[route_a][i], mutated[route_b][j] = mutated[route_b][j], mutated[route_a][i].</w:t>
+      </w:r>
+    </w:p>
+    <w:p>
+      <w:r>
+        <w:rPr>
+          <w:rFonts w:ascii="Times New Roman" w:hAnsi="Times New Roman"/>
+        </w:rPr>
+        <w:t>Tipo 3 — Reordenar rota (reorder):</w:t>
+      </w:r>
+      <w:r>
+        <w:rPr>
+          <w:rFonts w:ascii="Times New Roman" w:hAnsi="Times New Roman"/>
+        </w:rPr>
+        <w:br/>
+        <w:t>Seleciona uma rota não-vazia e troca duas entregas adjacentes (swap de posições consecutivas). Esta operação não altera a distribuição entre veículos — apenas a sequência de visita dentro de uma rota. É análoga à mutação por swap do TSP e explora o espaço de ordenação local.</w:t>
+      </w:r>
+      <w:r>
+        <w:rPr>
+          <w:rFonts w:ascii="Times New Roman" w:hAnsi="Times New Roman"/>
+        </w:rPr>
+        <w:br/>
+        <w:t>Implementação: index = random.randrange(len(route) - 1); route[index], route[index + 1] = route[index + 1], route[index].</w:t>
+      </w:r>
+    </w:p>
+    <w:p>
+      <w:pPr>
+        <w:rPr>
+          <w:rFonts w:ascii="Times New Roman" w:hAnsi="Times New Roman"/>
+        </w:rPr>
+      </w:pPr>
+      <w:r>
+        <w:rPr>
+          <w:rFonts w:ascii="Times New Roman" w:hAnsi="Times New Roman"/>
+        </w:rPr>
+        <w:t xml:space="preserve">Os três tipos garantem que o AG explore simultaneamente: (a) redistribuição de entregas entre veículos, (b) trocas de atribuição e (c) reordenação dentro das rotas. A seleção aleatória uniforme entre os tipos evita que o algoritmo fique preso em um único modo de exploração. A mutação é aplicada apenas uma vez por cromossomo por geração — </w:t>
+      </w:r>
+      <w:proofErr w:type="spellStart"/>
+      <w:r>
+        <w:rPr>
+          <w:rFonts w:ascii="Times New Roman" w:hAnsi="Times New Roman"/>
+        </w:rPr>
+        <w:t>não</w:t>
+      </w:r>
+      <w:proofErr w:type="spellEnd"/>
+      <w:r>
+        <w:rPr>
+          <w:rFonts w:ascii="Times New Roman" w:hAnsi="Times New Roman"/>
+        </w:rPr>
+        <w:t xml:space="preserve"> de forma </w:t>
+      </w:r>
+      <w:proofErr w:type="spellStart"/>
+      <w:r>
+        <w:rPr>
+          <w:rFonts w:ascii="Times New Roman" w:hAnsi="Times New Roman"/>
+        </w:rPr>
+        <w:t>acumulativa</w:t>
+      </w:r>
+      <w:proofErr w:type="spellEnd"/>
+      <w:r>
+        <w:rPr>
+          <w:rFonts w:ascii="Times New Roman" w:hAnsi="Times New Roman"/>
+        </w:rPr>
+        <w:t>.</w:t>
+      </w:r>
+    </w:p>
+    <w:p>
+      <w:pPr>
+        <w:rPr>
+          <w:rFonts w:ascii="Times New Roman" w:hAnsi="Times New Roman"/>
+        </w:rPr>
+      </w:pPr>
+    </w:p>
+    <w:p>
+      <w:pPr>
+        <w:rPr>
+          <w:rFonts w:ascii="Times New Roman" w:hAnsi="Times New Roman"/>
+        </w:rPr>
+      </w:pPr>
+    </w:p>
+    <w:p/>
+    <w:p>
+      <w:r>
+        <w:rPr>
+          <w:rFonts w:ascii="Times New Roman" w:hAnsi="Times New Roman"/>
+        </w:rPr>
+        <w:lastRenderedPageBreak/>
+        <w:t>4.5.3 População Inicial do VRP</w:t>
+      </w:r>
+    </w:p>
+    <w:p>
+      <w:r>
+        <w:rPr>
+          <w:rFonts w:ascii="Times New Roman" w:hAnsi="Times New Roman"/>
+        </w:rPr>
+        <w:t>A população inicial do VRP combina duas estratégias para equilibrar qualidade inicial e diversidade genética:</w:t>
+      </w:r>
+    </w:p>
+    <w:p>
+      <w:r>
+        <w:rPr>
+          <w:rFonts w:ascii="Times New Roman" w:hAnsi="Times New Roman"/>
+        </w:rPr>
+        <w:t>• 1 solução heurística determinística: as entregas são ordenadas por prioridade (HIGH → MEDIUM → LOW), depois por prazo (due_time crescente) e por fim por id. Essa sequência é distribuída pelos veículos tentando respeitar max_capacity: a entrega vai para o veículo com menor carga atual que ainda cabe a entrega; se nenhum couber, vai para o veículo com menor carga total. Esta solução garante que a população inicie com pelo menos uma configuração sensata.</w:t>
+      </w:r>
+    </w:p>
+    <w:p>
+      <w:r>
+        <w:rPr>
+          <w:rFonts w:ascii="Times New Roman" w:hAnsi="Times New Roman"/>
+        </w:rPr>
+        <w:t>• N−1 soluções aleatórias: cada entrega é alocada a um veículo escolhido aleatoriamente, sem respeitar capacidade ou prioridade. A ordem dentro de cada rota também é aleatória. Isso garante diversidade genética suficiente para que o AG explore o espaço de busca sem convergir prematuramente.</w:t>
+      </w:r>
+    </w:p>
+    <w:p>
+      <w:r>
+        <w:rPr>
+          <w:rFonts w:ascii="Times New Roman" w:hAnsi="Times New Roman"/>
+        </w:rPr>
+        <w:t>4.5.4 Elitismo no VRP</w:t>
+      </w:r>
+    </w:p>
+    <w:p>
+      <w:r>
+        <w:rPr>
+          <w:rFonts w:ascii="Times New Roman" w:hAnsi="Times New Roman"/>
+        </w:rPr>
+        <w:t>O elitismo preserva os elite_size melhores cromossomos de frota (menor fitness_total) diretamente para a próxima geração, sem crossover nem mutação. Os demais (population_size − elite_size) filhos são gerados via fleet_crossover + mutate_fleet, com pais selecionados aleatoriamente do parent_pool (os parent_pool_size melhores indivíduos da geração atual). Este mecanismo garante que o melhor resultado encontrado nunca se perde entre gerações.</w:t>
+      </w:r>
+    </w:p>
+    <w:p>
       <w:pPr>
         <w:spacing w:after="120" w:line="360" w:lineRule="auto"/>
         <w:ind w:firstLine="709"/>
@@ -2807,7 +3580,6 @@
           <w:color w:val="7C3AED"/>
           <w:sz w:val="24"/>
         </w:rPr>
-        <w:lastRenderedPageBreak/>
         <w:t>4.6 Camada LLM</w:t>
       </w:r>
     </w:p>
@@ -2913,14 +3685,26 @@
     <w:p>
       <w:pPr>
         <w:spacing w:before="360" w:after="120" w:line="360" w:lineRule="exact"/>
-      </w:pPr>
-      <w:r>
         <w:rPr>
           <w:rFonts w:ascii="Arial" w:hAnsi="Arial"/>
           <w:b/>
           <w:color w:val="6B21A8"/>
           <w:sz w:val="26"/>
         </w:rPr>
+      </w:pPr>
+    </w:p>
+    <w:p>
+      <w:pPr>
+        <w:spacing w:before="360" w:after="120" w:line="360" w:lineRule="exact"/>
+      </w:pPr>
+      <w:r>
+        <w:rPr>
+          <w:rFonts w:ascii="Arial" w:hAnsi="Arial"/>
+          <w:b/>
+          <w:color w:val="6B21A8"/>
+          <w:sz w:val="26"/>
+        </w:rPr>
+        <w:lastRenderedPageBreak/>
         <w:t>5 EXPERIMENTOS</w:t>
       </w:r>
     </w:p>
@@ -4375,21 +5159,643 @@
       </w:r>
     </w:p>
     <w:p>
+      <w:r>
+        <w:rPr>
+          <w:rFonts w:ascii="Times New Roman" w:hAnsi="Times New Roman"/>
+        </w:rPr>
+        <w:t>5.1 Pergunta de Pesquisa</w:t>
+      </w:r>
+    </w:p>
+    <w:p>
+      <w:r>
+        <w:rPr>
+          <w:rFonts w:ascii="Times New Roman" w:hAnsi="Times New Roman"/>
+        </w:rPr>
+        <w:t>Como o tamanho da população e a presença de elitismo afetam a qualidade da solução, a velocidade de convergência e o custo computacional do AG no problema VRP com restrições operacionais (prioridade, capacidade e autonomia)?</w:t>
+      </w:r>
+    </w:p>
+    <w:p>
+      <w:r>
+        <w:rPr>
+          <w:rFonts w:ascii="Times New Roman" w:hAnsi="Times New Roman"/>
+        </w:rPr>
+        <w:t>5.2 Setup Experimental</w:t>
+      </w:r>
+    </w:p>
+    <w:p>
+      <w:pPr>
+        <w:rPr>
+          <w:rFonts w:ascii="Times New Roman" w:hAnsi="Times New Roman"/>
+        </w:rPr>
+      </w:pPr>
+      <w:r>
+        <w:rPr>
+          <w:rFonts w:ascii="Times New Roman" w:hAnsi="Times New Roman"/>
+        </w:rPr>
+        <w:t xml:space="preserve">Todas as configurações foram executadas sobre o mesmo dataset (data/deliveries_sample.csv, com todos os veículos de vehicles_sample.csv), com semente fixa para reprodutibilidade, durante 500 gerações cada. As métricas coletadas foram: fitness final </w:t>
+      </w:r>
+      <w:proofErr w:type="gramStart"/>
+      <w:r>
+        <w:rPr>
+          <w:rFonts w:ascii="Times New Roman" w:hAnsi="Times New Roman"/>
+        </w:rPr>
+        <w:t>do</w:t>
+      </w:r>
+      <w:proofErr w:type="gramEnd"/>
+      <w:r>
+        <w:rPr>
+          <w:rFonts w:ascii="Times New Roman" w:hAnsi="Times New Roman"/>
+        </w:rPr>
+        <w:t xml:space="preserve"> melhor indivíduo, geração de convergência (última geração com melhoria do best fitness), tempo total de execução em segundos e melhoria relativa do fitness (fitness_inicial − </w:t>
+      </w:r>
+      <w:proofErr w:type="spellStart"/>
+      <w:r>
+        <w:rPr>
+          <w:rFonts w:ascii="Times New Roman" w:hAnsi="Times New Roman"/>
+        </w:rPr>
+        <w:t>fitness_final</w:t>
+      </w:r>
+      <w:proofErr w:type="spellEnd"/>
+      <w:r>
+        <w:rPr>
+          <w:rFonts w:ascii="Times New Roman" w:hAnsi="Times New Roman"/>
+        </w:rPr>
+        <w:t xml:space="preserve">) / </w:t>
+      </w:r>
+      <w:proofErr w:type="spellStart"/>
+      <w:r>
+        <w:rPr>
+          <w:rFonts w:ascii="Times New Roman" w:hAnsi="Times New Roman"/>
+        </w:rPr>
+        <w:t>fitness_inicial</w:t>
+      </w:r>
+      <w:proofErr w:type="spellEnd"/>
+      <w:r>
+        <w:rPr>
+          <w:rFonts w:ascii="Times New Roman" w:hAnsi="Times New Roman"/>
+        </w:rPr>
+        <w:t>.</w:t>
+      </w:r>
+    </w:p>
+    <w:p>
+      <w:pPr>
+        <w:rPr>
+          <w:rFonts w:ascii="Times New Roman" w:hAnsi="Times New Roman"/>
+        </w:rPr>
+      </w:pPr>
+    </w:p>
+    <w:p>
+      <w:pPr>
+        <w:rPr>
+          <w:rFonts w:ascii="Times New Roman" w:hAnsi="Times New Roman"/>
+        </w:rPr>
+      </w:pPr>
+    </w:p>
+    <w:p/>
+    <w:p>
+      <w:r>
+        <w:rPr>
+          <w:rFonts w:ascii="Times New Roman" w:hAnsi="Times New Roman"/>
+        </w:rPr>
+        <w:lastRenderedPageBreak/>
+        <w:t>5.3 Análise: Robustez do Algoritmo</w:t>
+      </w:r>
+    </w:p>
+    <w:p>
+      <w:r>
+        <w:rPr>
+          <w:rFonts w:ascii="Times New Roman" w:hAnsi="Times New Roman"/>
+        </w:rPr>
+        <w:t>Todas as 5 configurações atingiram fitness final = 0,16, com desvio padrão zero. Este resultado demonstra que o AG implementado é robusto: independentemente do tamanho da população (50 a 500 indivíduos), a solução de qualidade equivalente é encontrada. Isso ocorre porque o espaço de busca do dataset utilizado é suficientemente pequeno para que todas as configurações convirjam para a mesma bacia de atração do ótimo local.</w:t>
+      </w:r>
+    </w:p>
+    <w:p>
+      <w:r>
+        <w:rPr>
+          <w:rFonts w:ascii="Times New Roman" w:hAnsi="Times New Roman"/>
+        </w:rPr>
+        <w:t>5.4 Análise: Custo por Geração</w:t>
+      </w:r>
+    </w:p>
+    <w:p>
+      <w:r>
+        <w:rPr>
+          <w:rFonts w:ascii="Times New Roman" w:hAnsi="Times New Roman"/>
+        </w:rPr>
+        <w:t>O custo computacional por geração escala aproximadamente de forma linear com o tamanho da população, conforme esperado para um AG com avaliação de fitness O(N):</w:t>
+      </w:r>
+    </w:p>
+    <w:p>
+      <w:r>
+        <w:rPr>
+          <w:rFonts w:ascii="Times New Roman" w:hAnsi="Times New Roman"/>
+        </w:rPr>
+        <w:t>• pop50:   1,323s / 500 gerações ≈  2,6 ms/geração</w:t>
+      </w:r>
+      <w:r>
+        <w:rPr>
+          <w:rFonts w:ascii="Times New Roman" w:hAnsi="Times New Roman"/>
+        </w:rPr>
+        <w:br/>
+        <w:t>• pop100:  2,588s / 500 gerações ≈  5,2 ms/geração  (≈ 2× pop50)</w:t>
+      </w:r>
+      <w:r>
+        <w:rPr>
+          <w:rFonts w:ascii="Times New Roman" w:hAnsi="Times New Roman"/>
+        </w:rPr>
+        <w:br/>
+        <w:t>• pop500: 13,404s / 500 gerações ≈ 26,8 ms/geração  (≈ 10× pop50)</w:t>
+      </w:r>
+    </w:p>
+    <w:p>
+      <w:r>
+        <w:rPr>
+          <w:rFonts w:ascii="Times New Roman" w:hAnsi="Times New Roman"/>
+        </w:rPr>
+        <w:t>A linearidade confirma que o gargalo é a avaliação dos fitness individuais — o crossover e a mutação têm custo desprezível em comparação. Isso implica que, para datasets maiores, otimizações na função de fitness (caching, vetorização com NumPy) teriam impacto direto na escalabilidade do sistema.</w:t>
+      </w:r>
+    </w:p>
+    <w:p>
+      <w:r>
+        <w:rPr>
+          <w:rFonts w:ascii="Times New Roman" w:hAnsi="Times New Roman"/>
+        </w:rPr>
+        <w:t>5.5 Análise: pop50 como Melhor Custo-Benefício</w:t>
+      </w:r>
+    </w:p>
+    <w:p>
+      <w:r>
+        <w:rPr>
+          <w:rFonts w:ascii="Times New Roman" w:hAnsi="Times New Roman"/>
+        </w:rPr>
+        <w:t>A configuração pop50 entregou o mesmo fitness que pop500 em 10 vezes menos tempo:</w:t>
+      </w:r>
+    </w:p>
+    <w:p>
+      <w:r>
+        <w:rPr>
+          <w:rFonts w:ascii="Times New Roman" w:hAnsi="Times New Roman"/>
+        </w:rPr>
+        <w:t>• pop50:  1,323s → fitness 0,16 → convergência na geração 103</w:t>
+      </w:r>
+      <w:r>
+        <w:rPr>
+          <w:rFonts w:ascii="Times New Roman" w:hAnsi="Times New Roman"/>
+        </w:rPr>
+        <w:br/>
+        <w:t>• pop500: 13,404s → fitness 0,16 → convergência na geração 33</w:t>
+      </w:r>
+      <w:r>
+        <w:rPr>
+          <w:rFonts w:ascii="Times New Roman" w:hAnsi="Times New Roman"/>
+        </w:rPr>
+        <w:br/>
+      </w:r>
+      <w:r>
+        <w:rPr>
+          <w:rFonts w:ascii="Times New Roman" w:hAnsi="Times New Roman"/>
+        </w:rPr>
+        <w:br/>
+        <w:t>Economia de tempo: 13,404 − 1,323 = 12,081s (redução de 91%)</w:t>
+      </w:r>
+      <w:r>
+        <w:rPr>
+          <w:rFonts w:ascii="Times New Roman" w:hAnsi="Times New Roman"/>
+        </w:rPr>
+        <w:br/>
+        <w:t>Speedup: 13,404 / 1,323 ≈ 10,1×</w:t>
+      </w:r>
+    </w:p>
+    <w:p>
+      <w:r>
+        <w:rPr>
+          <w:rFonts w:ascii="Times New Roman" w:hAnsi="Times New Roman"/>
+        </w:rPr>
+        <w:t>Embora pop500 convirja em apenas 33 gerações (versus 103 do pop50), o custo total é muito maior porque cada geração com 500 indivíduos é ~10× mais cara. Para aplicações com necessidade de execução rápida — como demonstrações ao vivo ou sistemas em produção com restrições de tempo de resposta — pop50 é a configuração recomendada.</w:t>
+      </w:r>
+    </w:p>
+    <w:p>
+      <w:r>
+        <w:rPr>
+          <w:rFonts w:ascii="Times New Roman" w:hAnsi="Times New Roman"/>
+        </w:rPr>
+        <w:t>5.6 Análise: Impacto do Elitismo</w:t>
+      </w:r>
+    </w:p>
+    <w:p>
+      <w:r>
+        <w:rPr>
+          <w:rFonts w:ascii="Times New Roman" w:hAnsi="Times New Roman"/>
+        </w:rPr>
+        <w:t>Os pares com e sem elitismo revelam um comportamento inesperado: a ausência de elitismo não prejudicou a qualidade final e, no caso do par pop100, acelerou levemente a convergência:</w:t>
+      </w:r>
+    </w:p>
+    <w:p>
+      <w:r>
+        <w:rPr>
+          <w:rFonts w:ascii="Times New Roman" w:hAnsi="Times New Roman"/>
+        </w:rPr>
+        <w:t>• pop100 (com elitismo, elite_size=2):    convergência na geração 187, tempo 2,588s</w:t>
+      </w:r>
+      <w:r>
+        <w:rPr>
+          <w:rFonts w:ascii="Times New Roman" w:hAnsi="Times New Roman"/>
+        </w:rPr>
+        <w:br/>
+        <w:t>• pop100_no_elitism (sem elitismo):       convergência na geração 176, tempo 2,639s</w:t>
+      </w:r>
+      <w:r>
+        <w:rPr>
+          <w:rFonts w:ascii="Times New Roman" w:hAnsi="Times New Roman"/>
+        </w:rPr>
+        <w:br/>
+        <w:t xml:space="preserve">  → sem elitismo convergiu 11 gerações antes (+5,9% mais rápido em gerações)</w:t>
+      </w:r>
+      <w:r>
+        <w:rPr>
+          <w:rFonts w:ascii="Times New Roman" w:hAnsi="Times New Roman"/>
+        </w:rPr>
+        <w:br/>
+      </w:r>
+      <w:r>
+        <w:rPr>
+          <w:rFonts w:ascii="Times New Roman" w:hAnsi="Times New Roman"/>
+        </w:rPr>
+        <w:br/>
+        <w:t>• pop500 (com elitismo, elite_size=6):    convergência na geração 33, tempo 13,404s</w:t>
+      </w:r>
+      <w:r>
+        <w:rPr>
+          <w:rFonts w:ascii="Times New Roman" w:hAnsi="Times New Roman"/>
+        </w:rPr>
+        <w:br/>
+        <w:t>• pop500_no_elitism (sem elitismo):       convergência na geração 33, tempo 13,425s</w:t>
+      </w:r>
+      <w:r>
+        <w:rPr>
+          <w:rFonts w:ascii="Times New Roman" w:hAnsi="Times New Roman"/>
+        </w:rPr>
+        <w:br/>
+        <w:t xml:space="preserve">  → comportamento idêntico</w:t>
+      </w:r>
+    </w:p>
+    <w:p>
+      <w:r>
+        <w:rPr>
+          <w:rFonts w:ascii="Times New Roman" w:hAnsi="Times New Roman"/>
+        </w:rPr>
+        <w:lastRenderedPageBreak/>
+        <w:t>A interpretação é que, no dataset utilizado, a pressão seletiva exercida pela seleção de pais (parent_pool com os melhores indivíduos) já é suficiente para guiar a convergência sem necessidade de preservação explícita da elite. Em datasets mais complexos ou com maior ruído na função de fitness, o elitismo tende a ser mais relevante para evitar a perda de soluções promissoras.</w:t>
+      </w:r>
+    </w:p>
+    <w:p>
+      <w:r>
+        <w:rPr>
+          <w:rFonts w:ascii="Times New Roman" w:hAnsi="Times New Roman"/>
+        </w:rPr>
+        <w:t>5.7 Artefatos dos Experimentos</w:t>
+      </w:r>
+    </w:p>
+    <w:p>
+      <w:r>
+        <w:rPr>
+          <w:rFonts w:ascii="Times New Roman" w:hAnsi="Times New Roman"/>
+        </w:rPr>
+        <w:t>O runner em src/metrics/ gera automaticamente os seguintes artefatos reproduzíveis:</w:t>
+      </w:r>
+      <w:r>
+        <w:rPr>
+          <w:rFonts w:ascii="Times New Roman" w:hAnsi="Times New Roman"/>
+        </w:rPr>
+        <w:br/>
+      </w:r>
+      <w:r>
+        <w:rPr>
+          <w:rFonts w:ascii="Times New Roman" w:hAnsi="Times New Roman"/>
+        </w:rPr>
+        <w:br/>
+        <w:t>• artifacts/experiments/sprint8_summary.csv  — tabela comparativa em formato CSV</w:t>
+      </w:r>
+      <w:r>
+        <w:rPr>
+          <w:rFonts w:ascii="Times New Roman" w:hAnsi="Times New Roman"/>
+        </w:rPr>
+        <w:br/>
+        <w:t>• artifacts/experiments/sprint8_summary.json — dados estruturados para integração</w:t>
+      </w:r>
+      <w:r>
+        <w:rPr>
+          <w:rFonts w:ascii="Times New Roman" w:hAnsi="Times New Roman"/>
+        </w:rPr>
+        <w:br/>
+        <w:t>• artifacts/experiments/sprint8_summary.md   — resumo legível em Markdown</w:t>
+      </w:r>
+      <w:r>
+        <w:rPr>
+          <w:rFonts w:ascii="Times New Roman" w:hAnsi="Times New Roman"/>
+        </w:rPr>
+        <w:br/>
+        <w:t>• artifacts/charts/fitness_curves.png        — curvas de convergência por configuração</w:t>
+      </w:r>
+      <w:r>
+        <w:rPr>
+          <w:rFonts w:ascii="Times New Roman" w:hAnsi="Times New Roman"/>
+        </w:rPr>
+        <w:br/>
+        <w:t>• artifacts/charts/final_fitness.png         — comparativo do fitness final</w:t>
+      </w:r>
+      <w:r>
+        <w:rPr>
+          <w:rFonts w:ascii="Times New Roman" w:hAnsi="Times New Roman"/>
+        </w:rPr>
+        <w:br/>
+        <w:t>• artifacts/charts/execution_time.png        — comparativo do tempo de execução</w:t>
+      </w:r>
+      <w:r>
+        <w:rPr>
+          <w:rFonts w:ascii="Times New Roman" w:hAnsi="Times New Roman"/>
+        </w:rPr>
+        <w:br/>
+      </w:r>
+      <w:r>
+        <w:rPr>
+          <w:rFonts w:ascii="Times New Roman" w:hAnsi="Times New Roman"/>
+        </w:rPr>
+        <w:br/>
+        <w:t>Comando para reproduzir os experimentos:</w:t>
+      </w:r>
+      <w:r>
+        <w:rPr>
+          <w:rFonts w:ascii="Times New Roman" w:hAnsi="Times New Roman"/>
+        </w:rPr>
+        <w:br/>
+        <w:t>.venv/bin/python -m src.metrics \</w:t>
+      </w:r>
+      <w:r>
+        <w:rPr>
+          <w:rFonts w:ascii="Times New Roman" w:hAnsi="Times New Roman"/>
+        </w:rPr>
+        <w:br/>
+        <w:t xml:space="preserve">  --deliveries-file data/deliveries_sample.csv \</w:t>
+      </w:r>
+      <w:r>
+        <w:rPr>
+          <w:rFonts w:ascii="Times New Roman" w:hAnsi="Times New Roman"/>
+        </w:rPr>
+        <w:br/>
+        <w:t xml:space="preserve">  --vehicles-file  data/vehicles_sample.csv \</w:t>
+      </w:r>
+      <w:r>
+        <w:rPr>
+          <w:rFonts w:ascii="Times New Roman" w:hAnsi="Times New Roman"/>
+        </w:rPr>
+        <w:br/>
+        <w:t xml:space="preserve">  --output-dir     artifacts</w:t>
+      </w:r>
+    </w:p>
+    <w:p>
       <w:pPr>
         <w:spacing w:before="120" w:after="120" w:line="240" w:lineRule="auto"/>
         <w:ind w:left="567" w:right="567"/>
         <w:jc w:val="both"/>
-      </w:pPr>
-      <w:r>
         <w:rPr>
           <w:rFonts w:ascii="Times New Roman" w:hAnsi="Times New Roman"/>
           <w:i/>
           <w:color w:val="6B21A8"/>
           <w:sz w:val="20"/>
         </w:rPr>
-        <w:lastRenderedPageBreak/>
-        <w:t>NOTA: Os artefatos gerados pelos experimentos estão em artifacts/experiments/ (CSV, JSON e Markdown) e em artifacts/charts/ (gráficos de curvas de convergência, fitness final e tempo de execução).</w:t>
-      </w:r>
+      </w:pPr>
+      <w:r>
+        <w:rPr>
+          <w:rFonts w:ascii="Times New Roman" w:hAnsi="Times New Roman"/>
+          <w:i/>
+          <w:color w:val="6B21A8"/>
+          <w:sz w:val="20"/>
+        </w:rPr>
+        <w:t xml:space="preserve">NOTA: Os artefatos gerados pelos experimentos estão em artifacts/experiments/ (CSV, JSON e Markdown) e em artifacts/charts/ (gráficos de curvas de convergência, fitness final e tempo de </w:t>
+      </w:r>
+      <w:proofErr w:type="spellStart"/>
+      <w:r>
+        <w:rPr>
+          <w:rFonts w:ascii="Times New Roman" w:hAnsi="Times New Roman"/>
+          <w:i/>
+          <w:color w:val="6B21A8"/>
+          <w:sz w:val="20"/>
+        </w:rPr>
+        <w:t>execução</w:t>
+      </w:r>
+      <w:proofErr w:type="spellEnd"/>
+      <w:r>
+        <w:rPr>
+          <w:rFonts w:ascii="Times New Roman" w:hAnsi="Times New Roman"/>
+          <w:i/>
+          <w:color w:val="6B21A8"/>
+          <w:sz w:val="20"/>
+        </w:rPr>
+        <w:t>).</w:t>
+      </w:r>
+    </w:p>
+    <w:p>
+      <w:pPr>
+        <w:spacing w:before="120" w:after="120" w:line="240" w:lineRule="auto"/>
+        <w:ind w:left="567" w:right="567"/>
+        <w:jc w:val="both"/>
+        <w:rPr>
+          <w:rFonts w:ascii="Times New Roman" w:hAnsi="Times New Roman"/>
+          <w:i/>
+          <w:color w:val="6B21A8"/>
+          <w:sz w:val="20"/>
+        </w:rPr>
+      </w:pPr>
+    </w:p>
+    <w:p>
+      <w:pPr>
+        <w:spacing w:before="120" w:after="120" w:line="240" w:lineRule="auto"/>
+        <w:ind w:left="567" w:right="567"/>
+        <w:jc w:val="both"/>
+        <w:rPr>
+          <w:rFonts w:ascii="Times New Roman" w:hAnsi="Times New Roman"/>
+          <w:i/>
+          <w:color w:val="6B21A8"/>
+          <w:sz w:val="20"/>
+        </w:rPr>
+      </w:pPr>
+    </w:p>
+    <w:p>
+      <w:pPr>
+        <w:spacing w:before="120" w:after="120" w:line="240" w:lineRule="auto"/>
+        <w:ind w:left="567" w:right="567"/>
+        <w:jc w:val="both"/>
+        <w:rPr>
+          <w:rFonts w:ascii="Times New Roman" w:hAnsi="Times New Roman"/>
+          <w:i/>
+          <w:color w:val="6B21A8"/>
+          <w:sz w:val="20"/>
+        </w:rPr>
+      </w:pPr>
+    </w:p>
+    <w:p>
+      <w:pPr>
+        <w:spacing w:before="120" w:after="120" w:line="240" w:lineRule="auto"/>
+        <w:ind w:left="567" w:right="567"/>
+        <w:jc w:val="both"/>
+        <w:rPr>
+          <w:rFonts w:ascii="Times New Roman" w:hAnsi="Times New Roman"/>
+          <w:i/>
+          <w:color w:val="6B21A8"/>
+          <w:sz w:val="20"/>
+        </w:rPr>
+      </w:pPr>
+    </w:p>
+    <w:p>
+      <w:pPr>
+        <w:spacing w:before="120" w:after="120" w:line="240" w:lineRule="auto"/>
+        <w:ind w:left="567" w:right="567"/>
+        <w:jc w:val="both"/>
+        <w:rPr>
+          <w:rFonts w:ascii="Times New Roman" w:hAnsi="Times New Roman"/>
+          <w:i/>
+          <w:color w:val="6B21A8"/>
+          <w:sz w:val="20"/>
+        </w:rPr>
+      </w:pPr>
+    </w:p>
+    <w:p>
+      <w:pPr>
+        <w:spacing w:before="120" w:after="120" w:line="240" w:lineRule="auto"/>
+        <w:ind w:left="567" w:right="567"/>
+        <w:jc w:val="both"/>
+        <w:rPr>
+          <w:rFonts w:ascii="Times New Roman" w:hAnsi="Times New Roman"/>
+          <w:i/>
+          <w:color w:val="6B21A8"/>
+          <w:sz w:val="20"/>
+        </w:rPr>
+      </w:pPr>
+    </w:p>
+    <w:p>
+      <w:pPr>
+        <w:spacing w:before="120" w:after="120" w:line="240" w:lineRule="auto"/>
+        <w:ind w:left="567" w:right="567"/>
+        <w:jc w:val="both"/>
+        <w:rPr>
+          <w:rFonts w:ascii="Times New Roman" w:hAnsi="Times New Roman"/>
+          <w:i/>
+          <w:color w:val="6B21A8"/>
+          <w:sz w:val="20"/>
+        </w:rPr>
+      </w:pPr>
+    </w:p>
+    <w:p>
+      <w:pPr>
+        <w:spacing w:before="120" w:after="120" w:line="240" w:lineRule="auto"/>
+        <w:ind w:left="567" w:right="567"/>
+        <w:jc w:val="both"/>
+        <w:rPr>
+          <w:rFonts w:ascii="Times New Roman" w:hAnsi="Times New Roman"/>
+          <w:i/>
+          <w:color w:val="6B21A8"/>
+          <w:sz w:val="20"/>
+        </w:rPr>
+      </w:pPr>
+    </w:p>
+    <w:p>
+      <w:pPr>
+        <w:spacing w:before="120" w:after="120" w:line="240" w:lineRule="auto"/>
+        <w:ind w:left="567" w:right="567"/>
+        <w:jc w:val="both"/>
+        <w:rPr>
+          <w:rFonts w:ascii="Times New Roman" w:hAnsi="Times New Roman"/>
+          <w:i/>
+          <w:color w:val="6B21A8"/>
+          <w:sz w:val="20"/>
+        </w:rPr>
+      </w:pPr>
+    </w:p>
+    <w:p>
+      <w:pPr>
+        <w:spacing w:before="120" w:after="120" w:line="240" w:lineRule="auto"/>
+        <w:ind w:left="567" w:right="567"/>
+        <w:jc w:val="both"/>
+        <w:rPr>
+          <w:rFonts w:ascii="Times New Roman" w:hAnsi="Times New Roman"/>
+          <w:i/>
+          <w:color w:val="6B21A8"/>
+          <w:sz w:val="20"/>
+        </w:rPr>
+      </w:pPr>
+    </w:p>
+    <w:p>
+      <w:pPr>
+        <w:spacing w:before="120" w:after="120" w:line="240" w:lineRule="auto"/>
+        <w:ind w:left="567" w:right="567"/>
+        <w:jc w:val="both"/>
+        <w:rPr>
+          <w:rFonts w:ascii="Times New Roman" w:hAnsi="Times New Roman"/>
+          <w:i/>
+          <w:color w:val="6B21A8"/>
+          <w:sz w:val="20"/>
+        </w:rPr>
+      </w:pPr>
+    </w:p>
+    <w:p>
+      <w:pPr>
+        <w:spacing w:before="120" w:after="120" w:line="240" w:lineRule="auto"/>
+        <w:ind w:left="567" w:right="567"/>
+        <w:jc w:val="both"/>
+        <w:rPr>
+          <w:rFonts w:ascii="Times New Roman" w:hAnsi="Times New Roman"/>
+          <w:i/>
+          <w:color w:val="6B21A8"/>
+          <w:sz w:val="20"/>
+        </w:rPr>
+      </w:pPr>
+    </w:p>
+    <w:p>
+      <w:pPr>
+        <w:spacing w:before="120" w:after="120" w:line="240" w:lineRule="auto"/>
+        <w:ind w:left="567" w:right="567"/>
+        <w:jc w:val="both"/>
+        <w:rPr>
+          <w:rFonts w:ascii="Times New Roman" w:hAnsi="Times New Roman"/>
+          <w:i/>
+          <w:color w:val="6B21A8"/>
+          <w:sz w:val="20"/>
+        </w:rPr>
+      </w:pPr>
+    </w:p>
+    <w:p>
+      <w:pPr>
+        <w:spacing w:before="120" w:after="120" w:line="240" w:lineRule="auto"/>
+        <w:ind w:left="567" w:right="567"/>
+        <w:jc w:val="both"/>
+        <w:rPr>
+          <w:rFonts w:ascii="Times New Roman" w:hAnsi="Times New Roman"/>
+          <w:i/>
+          <w:color w:val="6B21A8"/>
+          <w:sz w:val="20"/>
+        </w:rPr>
+      </w:pPr>
+    </w:p>
+    <w:p>
+      <w:pPr>
+        <w:spacing w:before="120" w:after="120" w:line="240" w:lineRule="auto"/>
+        <w:ind w:left="567" w:right="567"/>
+        <w:jc w:val="both"/>
+        <w:rPr>
+          <w:rFonts w:ascii="Times New Roman" w:hAnsi="Times New Roman"/>
+          <w:i/>
+          <w:color w:val="6B21A8"/>
+          <w:sz w:val="20"/>
+        </w:rPr>
+      </w:pPr>
+    </w:p>
+    <w:p>
+      <w:pPr>
+        <w:spacing w:before="120" w:after="120" w:line="240" w:lineRule="auto"/>
+        <w:ind w:left="567" w:right="567"/>
+        <w:jc w:val="both"/>
+      </w:pPr>
     </w:p>
     <w:p>
       <w:pPr>
@@ -4402,6 +5808,7 @@
           <w:color w:val="6B21A8"/>
           <w:sz w:val="26"/>
         </w:rPr>
+        <w:lastRenderedPageBreak/>
         <w:t>6 RESULTADOS</w:t>
       </w:r>
     </w:p>
@@ -4612,6 +6019,208 @@
       </w:r>
     </w:p>
     <w:p>
+      <w:r>
+        <w:rPr>
+          <w:rFonts w:ascii="Times New Roman" w:hAnsi="Times New Roman"/>
+        </w:rPr>
+        <w:t>6.1 Métricas de Qualidade Consolidadas</w:t>
+      </w:r>
+    </w:p>
+    <w:p>
+      <w:r>
+        <w:rPr>
+          <w:rFonts w:ascii="Times New Roman" w:hAnsi="Times New Roman"/>
+        </w:rPr>
+        <w:t>A tabela a seguir consolida as métricas de qualidade do projeto completo:</w:t>
+      </w:r>
+    </w:p>
+    <w:p>
+      <w:r>
+        <w:rPr>
+          <w:rFonts w:ascii="Times New Roman" w:hAnsi="Times New Roman"/>
+        </w:rPr>
+        <w:t>• Testes automatizados: 62 passed (100% de aprovação, zero falhas)</w:t>
+      </w:r>
+      <w:r>
+        <w:rPr>
+          <w:rFonts w:ascii="Times New Roman" w:hAnsi="Times New Roman"/>
+        </w:rPr>
+        <w:br/>
+        <w:t>• Fitness final VRP (todas as 5 configurações): 0,16</w:t>
+      </w:r>
+      <w:r>
+        <w:rPr>
+          <w:rFonts w:ascii="Times New Roman" w:hAnsi="Times New Roman"/>
+        </w:rPr>
+        <w:br/>
+        <w:t>• Desvio padrão do fitness entre configurações: 0,00</w:t>
+      </w:r>
+      <w:r>
+        <w:rPr>
+          <w:rFonts w:ascii="Times New Roman" w:hAnsi="Times New Roman"/>
+        </w:rPr>
+        <w:br/>
+        <w:t>• Melhor tempo de execução (pop50): 1,323s</w:t>
+      </w:r>
+      <w:r>
+        <w:rPr>
+          <w:rFonts w:ascii="Times New Roman" w:hAnsi="Times New Roman"/>
+        </w:rPr>
+        <w:br/>
+        <w:t>• Speedup pop50 vs pop500: ≈ 10×</w:t>
+      </w:r>
+      <w:r>
+        <w:rPr>
+          <w:rFonts w:ascii="Times New Roman" w:hAnsi="Times New Roman"/>
+        </w:rPr>
+        <w:br/>
+        <w:t>• Melhoria de fitness (pop50 e pop100): 0,40 (40%)</w:t>
+      </w:r>
+      <w:r>
+        <w:rPr>
+          <w:rFonts w:ascii="Times New Roman" w:hAnsi="Times New Roman"/>
+        </w:rPr>
+        <w:br/>
+        <w:t>• Melhoria de fitness (pop500): 0,35 (35%)</w:t>
+      </w:r>
+      <w:r>
+        <w:rPr>
+          <w:rFonts w:ascii="Times New Roman" w:hAnsi="Times New Roman"/>
+        </w:rPr>
+        <w:br/>
+        <w:t>• Sprints concluídas: 9 de 9</w:t>
+      </w:r>
+      <w:r>
+        <w:rPr>
+          <w:rFonts w:ascii="Times New Roman" w:hAnsi="Times New Roman"/>
+        </w:rPr>
+        <w:br/>
+        <w:t>• Modos LLM implementados: 3 (report, instructions, question)</w:t>
+      </w:r>
+      <w:r>
+        <w:rPr>
+          <w:rFonts w:ascii="Times New Roman" w:hAnsi="Times New Roman"/>
+        </w:rPr>
+        <w:br/>
+        <w:t>• Configurações de experimento testadas: 5</w:t>
+      </w:r>
+    </w:p>
+    <w:p>
+      <w:r>
+        <w:rPr>
+          <w:rFonts w:ascii="Times New Roman" w:hAnsi="Times New Roman"/>
+        </w:rPr>
+        <w:lastRenderedPageBreak/>
+        <w:t>6.2 Validação por Testes Automatizados</w:t>
+      </w:r>
+    </w:p>
+    <w:p>
+      <w:r>
+        <w:rPr>
+          <w:rFonts w:ascii="Times New Roman" w:hAnsi="Times New Roman"/>
+        </w:rPr>
+        <w:t>A suite de testes cobre todos os componentes críticos do sistema:</w:t>
+      </w:r>
+    </w:p>
+    <w:p>
+      <w:r>
+        <w:rPr>
+          <w:rFonts w:ascii="Times New Roman" w:hAnsi="Times New Roman"/>
+        </w:rPr>
+        <w:t>• Algoritmo Genético (~15 testes): crossover OX, mutação por swap, população inicial aleatória, histórico de fitness, preservação de elite.</w:t>
+      </w:r>
+      <w:r>
+        <w:rPr>
+          <w:rFonts w:ascii="Times New Roman" w:hAnsi="Times New Roman"/>
+        </w:rPr>
+        <w:br/>
+        <w:t>• Função de Fitness (~10 testes): distância euclidiana, penalidade por atraso HIGH/MEDIUM/LOW, penalidade de capacidade, penalidade de autonomia, rota fechada.</w:t>
+      </w:r>
+      <w:r>
+        <w:rPr>
+          <w:rFonts w:ascii="Times New Roman" w:hAnsi="Times New Roman"/>
+        </w:rPr>
+        <w:br/>
+        <w:t>• Leitura de Dados (~8 testes): CSV de entregas, CSV de veículos, campos opcionais, validação de tipos.</w:t>
+      </w:r>
+      <w:r>
+        <w:rPr>
+          <w:rFonts w:ascii="Times New Roman" w:hAnsi="Times New Roman"/>
+        </w:rPr>
+        <w:br/>
+        <w:t>• CLI (~6 testes): parsing de argumentos, modo TSP/VRP, seleção de veículos por --vehicle-ids.</w:t>
+      </w:r>
+      <w:r>
+        <w:rPr>
+          <w:rFonts w:ascii="Times New Roman" w:hAnsi="Times New Roman"/>
+        </w:rPr>
+        <w:br/>
+        <w:t>• VRP (~12 testes): distribuição de entregas, fitness agregado, mutação inter-rota (move/swap/reorder), população de frota, iterate_vrp.</w:t>
+      </w:r>
+      <w:r>
+        <w:rPr>
+          <w:rFonts w:ascii="Times New Roman" w:hAnsi="Times New Roman"/>
+        </w:rPr>
+        <w:br/>
+        <w:t>• Camada LLM (~11 testes): construção de prompts, respostas offline, fallback sem API key, modos TSP e VRP.</w:t>
+      </w:r>
+    </w:p>
+    <w:p>
+      <w:r>
+        <w:rPr>
+          <w:rFonts w:ascii="Times New Roman" w:hAnsi="Times New Roman"/>
+        </w:rPr>
+        <w:t>6.3 Conclusão dos Experimentos VRP</w:t>
+      </w:r>
+    </w:p>
+    <w:p>
+      <w:r>
+        <w:rPr>
+          <w:rFonts w:ascii="Times New Roman" w:hAnsi="Times New Roman"/>
+        </w:rPr>
+        <w:t>Os experimentos confirmam três conclusões principais:</w:t>
+      </w:r>
+      <w:r>
+        <w:rPr>
+          <w:rFonts w:ascii="Times New Roman" w:hAnsi="Times New Roman"/>
+        </w:rPr>
+        <w:br/>
+      </w:r>
+      <w:r>
+        <w:rPr>
+          <w:rFonts w:ascii="Times New Roman" w:hAnsi="Times New Roman"/>
+        </w:rPr>
+        <w:br/>
+        <w:t>1. Robustez: o AG encontra soluções de qualidade equivalente (fitness 0,16) independentemente do tamanho da população, desde que o número de gerações seja suficiente. Isso valida a implementação dos operadores genéticos VRP (crossover de frota, mutação inter-rota) como corretos e eficazes.</w:t>
+      </w:r>
+      <w:r>
+        <w:rPr>
+          <w:rFonts w:ascii="Times New Roman" w:hAnsi="Times New Roman"/>
+        </w:rPr>
+        <w:br/>
+      </w:r>
+      <w:r>
+        <w:rPr>
+          <w:rFonts w:ascii="Times New Roman" w:hAnsi="Times New Roman"/>
+        </w:rPr>
+        <w:br/>
+        <w:t>2. Eficiência: para o dataset utilizado, populações menores (pop50) são significativamente mais eficientes que populações grandes (pop500), com speedup de ~10× sem perda de qualidade. Recomenda-se começar com populações menores e aumentar somente se a qualidade for insuficiente.</w:t>
+      </w:r>
+      <w:r>
+        <w:rPr>
+          <w:rFonts w:ascii="Times New Roman" w:hAnsi="Times New Roman"/>
+        </w:rPr>
+        <w:br/>
+      </w:r>
+      <w:r>
+        <w:rPr>
+          <w:rFonts w:ascii="Times New Roman" w:hAnsi="Times New Roman"/>
+        </w:rPr>
+        <w:br/>
+        <w:t>3. Elitismo: não foi fator determinante neste dataset — a pressão seletiva do parent_pool já é suficiente. Em problemas com paisagens de fitness mais ruidosas (muitos ótimos locais), o elitismo tende a ser mais relevante para estabilização.</w:t>
+      </w:r>
+    </w:p>
+    <w:p>
       <w:pPr>
         <w:spacing w:before="240" w:after="120" w:line="360" w:lineRule="auto"/>
         <w:ind w:firstLine="709"/>
@@ -4642,6 +6251,27 @@
           <w:rFonts w:ascii="Times New Roman" w:hAnsi="Times New Roman"/>
           <w:sz w:val="24"/>
         </w:rPr>
+      </w:pPr>
+    </w:p>
+    <w:p>
+      <w:pPr>
+        <w:spacing w:before="240" w:after="120" w:line="360" w:lineRule="auto"/>
+        <w:ind w:firstLine="709"/>
+        <w:jc w:val="both"/>
+      </w:pPr>
+    </w:p>
+    <w:p>
+      <w:pPr>
+        <w:spacing w:before="240" w:after="120" w:line="360" w:lineRule="auto"/>
+        <w:ind w:firstLine="709"/>
+        <w:jc w:val="both"/>
+      </w:pPr>
+    </w:p>
+    <w:p>
+      <w:pPr>
+        <w:spacing w:before="240" w:after="120" w:line="360" w:lineRule="auto"/>
+        <w:ind w:firstLine="709"/>
+        <w:jc w:val="both"/>
       </w:pPr>
     </w:p>
     <w:p>

</xml_diff>